<commit_message>
Update portfolio records, resume, and project showcase with Finance Tracker and Bemunchie
</commit_message>
<xml_diff>
--- a/output/resume/Cedrick_Opina_Resume.docx
+++ b/output/resume/Cedrick_Opina_Resume.docx
@@ -4,13 +4,13 @@
   <w:body>
     <w:p>
       <w:pPr>
-        <w:spacing w:before="0" w:after="30"/>
+        <w:spacing w:before="0" w:after="40"/>
         <w:jc w:val="center"/>
       </w:pPr>
       <w:r>
         <w:drawing>
           <wp:inline xmlns:a="http://schemas.openxmlformats.org/drawingml/2006/main" xmlns:pic="http://schemas.openxmlformats.org/drawingml/2006/picture">
-            <wp:extent cx="694944" cy="694944"/>
+            <wp:extent cx="777240" cy="777240"/>
             <wp:docPr id="1" name="Picture 1" descr="Professional portrait of Cedrick Opina" title="Cedrick Opina profile photo"/>
             <wp:cNvGraphicFramePr>
               <a:graphicFrameLocks noChangeAspect="1"/>
@@ -31,7 +31,7 @@
                   <pic:spPr>
                     <a:xfrm>
                       <a:off x="0" y="0"/>
-                      <a:ext cx="694944" cy="694944"/>
+                      <a:ext cx="777240" cy="777240"/>
                     </a:xfrm>
                     <a:prstGeom prst="rect"/>
                   </pic:spPr>
@@ -44,7 +44,7 @@
     </w:p>
     <w:p>
       <w:pPr>
-        <w:spacing w:before="0" w:after="10"/>
+        <w:spacing w:before="0" w:after="20"/>
         <w:jc w:val="center"/>
       </w:pPr>
       <w:r>
@@ -53,14 +53,14 @@
           <w:b/>
           <w:i w:val="0"/>
           <w:color w:val="0B2B26"/>
-          <w:sz w:val="41"/>
+          <w:sz w:val="42"/>
         </w:rPr>
         <w:t>CEDRICK OPINA</w:t>
       </w:r>
     </w:p>
     <w:p>
       <w:pPr>
-        <w:spacing w:before="0" w:after="24"/>
+        <w:spacing w:before="0" w:after="30"/>
         <w:jc w:val="center"/>
       </w:pPr>
       <w:r>
@@ -69,14 +69,14 @@
           <w:b/>
           <w:i w:val="0"/>
           <w:color w:val="235347"/>
-          <w:sz w:val="20"/>
+          <w:sz w:val="21"/>
         </w:rPr>
-        <w:t>Website Developer &amp; Quality Assurance Specialist</w:t>
+        <w:t>WEBSITE DEVELOPER &amp; QUALITY ASSURANCE SPECIALIST</w:t>
       </w:r>
     </w:p>
     <w:p>
       <w:pPr>
-        <w:spacing w:before="0" w:after="44"/>
+        <w:spacing w:before="0" w:after="80"/>
         <w:jc w:val="center"/>
       </w:pPr>
       <w:r>
@@ -85,7 +85,7 @@
           <w:b w:val="0"/>
           <w:i w:val="0"/>
           <w:color w:val="52615D"/>
-          <w:sz w:val="15"/>
+          <w:sz w:val="16"/>
         </w:rPr>
         <w:t>+63 969 180 5714  |  opinacedrickr@gmail.com  |  Quezon City, Philippines</w:t>
         <w:br/>
@@ -103,14 +103,14 @@
           <w:b/>
           <w:i w:val="0"/>
           <w:color w:val="235347"/>
-          <w:sz w:val="20"/>
+          <w:sz w:val="21"/>
         </w:rPr>
         <w:t>PROFESSIONAL SUMMARY</w:t>
       </w:r>
     </w:p>
     <w:p>
       <w:pPr>
-        <w:spacing w:after="20" w:line="250" w:lineRule="auto"/>
+        <w:spacing w:after="60" w:line="259" w:lineRule="auto"/>
       </w:pPr>
       <w:r>
         <w:rPr>
@@ -118,7 +118,7 @@
           <w:b w:val="0"/>
           <w:i w:val="0"/>
           <w:color w:val="17211F"/>
-          <w:sz w:val="16"/>
+          <w:sz w:val="18"/>
         </w:rPr>
         <w:t>Quality-focused website developer and QA specialist with experience in WordPress and Elementor development, finance mobile and web testing, Maestro automation, UI/UX evaluation, technical SEO, and client website support. Combines development and testing skills to build reliable digital experiences, identify usability issues, and improve websites for users and businesses.</w:t>
       </w:r>
@@ -134,7 +134,7 @@
           <w:b/>
           <w:i w:val="0"/>
           <w:color w:val="235347"/>
-          <w:sz w:val="20"/>
+          <w:sz w:val="21"/>
         </w:rPr>
         <w:t>PROFESSIONAL EXPERIENCE</w:t>
       </w:r>
@@ -143,9 +143,9 @@
       <w:pPr>
         <w:keepNext/>
         <w:tabs>
-          <w:tab w:pos="10368" w:val="right"/>
+          <w:tab w:pos="10224" w:val="right"/>
         </w:tabs>
-        <w:spacing w:before="40" w:after="0"/>
+        <w:spacing w:before="60" w:after="0"/>
       </w:pPr>
       <w:r>
         <w:rPr>
@@ -153,9 +153,9 @@
           <w:b/>
           <w:i w:val="0"/>
           <w:color w:val="0B2B26"/>
-          <w:sz w:val="17"/>
+          <w:sz w:val="19"/>
         </w:rPr>
-        <w:t>HeyPenny | Quality Assurance Tester (Part-time)</w:t>
+        <w:t>Quality Assurance Tester (Part-time)</w:t>
       </w:r>
       <w:r>
         <w:tab/>
@@ -166,15 +166,31 @@
           <w:b/>
           <w:i w:val="0"/>
           <w:color w:val="52615D"/>
-          <w:sz w:val="16"/>
+          <w:sz w:val="18"/>
         </w:rPr>
         <w:t>Nov 2025 - Present</w:t>
       </w:r>
     </w:p>
     <w:p>
       <w:pPr>
+        <w:keepNext/>
+        <w:spacing w:before="0" w:after="30"/>
+      </w:pPr>
+      <w:r>
+        <w:rPr>
+          <w:rFonts w:ascii="Arial" w:hAnsi="Arial"/>
+          <w:b w:val="0"/>
+          <w:i/>
+          <w:color w:val="52615D"/>
+          <w:sz w:val="17"/>
+        </w:rPr>
+        <w:t>HeyPenny | Part-time</w:t>
+      </w:r>
+    </w:p>
+    <w:p>
+      <w:pPr>
         <w:keepLines/>
-        <w:spacing w:before="0" w:after="24" w:line="245" w:lineRule="auto"/>
+        <w:spacing w:before="0" w:after="40" w:line="252" w:lineRule="auto"/>
         <w:numPr>
           <w:ilvl w:val="0"/>
           <w:numId w:val="10"/>
@@ -186,7 +202,7 @@
           <w:b w:val="0"/>
           <w:i w:val="0"/>
           <w:color w:val="17211F"/>
-          <w:sz w:val="16"/>
+          <w:sz w:val="18"/>
         </w:rPr>
         <w:t>Test the Penny finance mobile application and web platform across functional, regression, responsive, and UI/UX scenarios.</w:t>
       </w:r>
@@ -194,7 +210,7 @@
     <w:p>
       <w:pPr>
         <w:keepLines/>
-        <w:spacing w:before="0" w:after="24" w:line="245" w:lineRule="auto"/>
+        <w:spacing w:before="0" w:after="40" w:line="252" w:lineRule="auto"/>
         <w:numPr>
           <w:ilvl w:val="0"/>
           <w:numId w:val="10"/>
@@ -206,7 +222,7 @@
           <w:b w:val="0"/>
           <w:i w:val="0"/>
           <w:color w:val="17211F"/>
-          <w:sz w:val="16"/>
+          <w:sz w:val="18"/>
         </w:rPr>
         <w:t>Create repeatable Maestro automation flows for key finance workflows and maintain structured test coverage.</w:t>
       </w:r>
@@ -214,7 +230,7 @@
     <w:p>
       <w:pPr>
         <w:keepLines/>
-        <w:spacing w:before="0" w:after="24" w:line="245" w:lineRule="auto"/>
+        <w:spacing w:before="0" w:after="40" w:line="252" w:lineRule="auto"/>
         <w:numPr>
           <w:ilvl w:val="0"/>
           <w:numId w:val="10"/>
@@ -226,7 +242,7 @@
           <w:b w:val="0"/>
           <w:i w:val="0"/>
           <w:color w:val="17211F"/>
-          <w:sz w:val="16"/>
+          <w:sz w:val="18"/>
         </w:rPr>
         <w:t>Document defects with clear reproduction steps and review navigation, consistency, and user friction across releases.</w:t>
       </w:r>
@@ -235,9 +251,9 @@
       <w:pPr>
         <w:keepNext/>
         <w:tabs>
-          <w:tab w:pos="10368" w:val="right"/>
+          <w:tab w:pos="10224" w:val="right"/>
         </w:tabs>
-        <w:spacing w:before="40" w:after="0"/>
+        <w:spacing w:before="60" w:after="0"/>
       </w:pPr>
       <w:r>
         <w:rPr>
@@ -245,9 +261,9 @@
           <w:b/>
           <w:i w:val="0"/>
           <w:color w:val="0B2B26"/>
-          <w:sz w:val="17"/>
+          <w:sz w:val="19"/>
         </w:rPr>
-        <w:t>GodesQ Digital Marketing Services | Website Developer, QA &amp; SEO Specialist</w:t>
+        <w:t>Website Developer, QA &amp; SEO Specialist</w:t>
       </w:r>
       <w:r>
         <w:tab/>
@@ -258,15 +274,15 @@
           <w:b/>
           <w:i w:val="0"/>
           <w:color w:val="52615D"/>
-          <w:sz w:val="16"/>
+          <w:sz w:val="18"/>
         </w:rPr>
-        <w:t>Jun 2025 - Present</w:t>
+        <w:t>Jan 2024 - Apr 2024</w:t>
       </w:r>
     </w:p>
     <w:p>
       <w:pPr>
         <w:keepNext/>
-        <w:spacing w:before="0" w:after="20"/>
+        <w:spacing w:before="0" w:after="30"/>
       </w:pPr>
       <w:r>
         <w:rPr>
@@ -274,15 +290,15 @@
           <w:b w:val="0"/>
           <w:i/>
           <w:color w:val="52615D"/>
-          <w:sz w:val="16"/>
+          <w:sz w:val="17"/>
         </w:rPr>
-        <w:t>Part-time from June 1, 2025; full-time since July 30, 2025</w:t>
+        <w:t>GodesQ Digital Marketing Services</w:t>
       </w:r>
     </w:p>
     <w:p>
       <w:pPr>
         <w:keepLines/>
-        <w:spacing w:before="0" w:after="24" w:line="245" w:lineRule="auto"/>
+        <w:spacing w:before="0" w:after="40" w:line="252" w:lineRule="auto"/>
         <w:numPr>
           <w:ilvl w:val="0"/>
           <w:numId w:val="10"/>
@@ -294,7 +310,7 @@
           <w:b w:val="0"/>
           <w:i w:val="0"/>
           <w:color w:val="17211F"/>
-          <w:sz w:val="16"/>
+          <w:sz w:val="18"/>
         </w:rPr>
         <w:t>Develop and maintain client websites with WordPress and Elementor, contribute to Shopify updates, and troubleshoot frontend issues.</w:t>
       </w:r>
@@ -302,7 +318,7 @@
     <w:p>
       <w:pPr>
         <w:keepLines/>
-        <w:spacing w:before="0" w:after="24" w:line="245" w:lineRule="auto"/>
+        <w:spacing w:before="0" w:after="40" w:line="252" w:lineRule="auto"/>
         <w:numPr>
           <w:ilvl w:val="0"/>
           <w:numId w:val="10"/>
@@ -314,7 +330,7 @@
           <w:b w:val="0"/>
           <w:i w:val="0"/>
           <w:color w:val="17211F"/>
-          <w:sz w:val="16"/>
+          <w:sz w:val="18"/>
         </w:rPr>
         <w:t>Perform functional, responsive, UI/UX, and performance QA for client websites and digital experiences.</w:t>
       </w:r>
@@ -322,7 +338,7 @@
     <w:p>
       <w:pPr>
         <w:keepLines/>
-        <w:spacing w:before="0" w:after="24" w:line="245" w:lineRule="auto"/>
+        <w:spacing w:before="0" w:after="40" w:line="252" w:lineRule="auto"/>
         <w:numPr>
           <w:ilvl w:val="0"/>
           <w:numId w:val="10"/>
@@ -334,7 +350,7 @@
           <w:b w:val="0"/>
           <w:i w:val="0"/>
           <w:color w:val="17211F"/>
-          <w:sz w:val="16"/>
+          <w:sz w:val="18"/>
         </w:rPr>
         <w:t>Support technical and on-page SEO with Semrush, including site audits, keyword checks, issue diagnosis, and content recommendations.</w:t>
       </w:r>
@@ -342,7 +358,7 @@
     <w:p>
       <w:pPr>
         <w:keepLines/>
-        <w:spacing w:before="0" w:after="24" w:line="245" w:lineRule="auto"/>
+        <w:spacing w:before="0" w:after="40" w:line="252" w:lineRule="auto"/>
         <w:numPr>
           <w:ilvl w:val="0"/>
           <w:numId w:val="10"/>
@@ -354,7 +370,7 @@
           <w:b w:val="0"/>
           <w:i w:val="0"/>
           <w:color w:val="17211F"/>
-          <w:sz w:val="16"/>
+          <w:sz w:val="18"/>
         </w:rPr>
         <w:t>Handle client work for Bemunchie and Freedom Family Investments, alongside projects including Maria and I, Go To SHOUT, and ProAge Beauty.</w:t>
       </w:r>
@@ -370,7 +386,7 @@
           <w:b/>
           <w:i w:val="0"/>
           <w:color w:val="235347"/>
-          <w:sz w:val="20"/>
+          <w:sz w:val="21"/>
         </w:rPr>
         <w:t>SELECTED PROJECTS</w:t>
       </w:r>
@@ -379,9 +395,9 @@
       <w:pPr>
         <w:keepNext/>
         <w:tabs>
-          <w:tab w:pos="10368" w:val="right"/>
+          <w:tab w:pos="10224" w:val="right"/>
         </w:tabs>
-        <w:spacing w:before="40" w:after="0"/>
+        <w:spacing w:before="60" w:after="0"/>
       </w:pPr>
       <w:r>
         <w:rPr>
@@ -389,9 +405,9 @@
           <w:b/>
           <w:i w:val="0"/>
           <w:color w:val="0B2B26"/>
-          <w:sz w:val="17"/>
+          <w:sz w:val="19"/>
         </w:rPr>
-        <w:t>Penny QA Desk | Personal Project</w:t>
+        <w:t>QA Desk</w:t>
       </w:r>
       <w:r>
         <w:tab/>
@@ -402,15 +418,31 @@
           <w:b/>
           <w:i w:val="0"/>
           <w:color w:val="52615D"/>
-          <w:sz w:val="16"/>
+          <w:sz w:val="18"/>
         </w:rPr>
         <w:t>2026</w:t>
       </w:r>
     </w:p>
     <w:p>
       <w:pPr>
+        <w:keepNext/>
+        <w:spacing w:before="0" w:after="30"/>
+      </w:pPr>
+      <w:r>
+        <w:rPr>
+          <w:rFonts w:ascii="Arial" w:hAnsi="Arial"/>
+          <w:b w:val="0"/>
+          <w:i/>
+          <w:color w:val="52615D"/>
+          <w:sz w:val="17"/>
+        </w:rPr>
+        <w:t>Personal Project</w:t>
+      </w:r>
+    </w:p>
+    <w:p>
+      <w:pPr>
         <w:keepLines/>
-        <w:spacing w:before="0" w:after="24" w:line="245" w:lineRule="auto"/>
+        <w:spacing w:before="0" w:after="40" w:line="252" w:lineRule="auto"/>
         <w:numPr>
           <w:ilvl w:val="0"/>
           <w:numId w:val="10"/>
@@ -422,7 +454,7 @@
           <w:b w:val="0"/>
           <w:i w:val="0"/>
           <w:color w:val="17211F"/>
-          <w:sz w:val="16"/>
+          <w:sz w:val="18"/>
         </w:rPr>
         <w:t>Built a QA task-management and tracking workspace for Penny mobile and web testing, organizing checks, bug reports, and completion history.</w:t>
       </w:r>
@@ -431,9 +463,9 @@
       <w:pPr>
         <w:keepNext/>
         <w:tabs>
-          <w:tab w:pos="10368" w:val="right"/>
+          <w:tab w:pos="10224" w:val="right"/>
         </w:tabs>
-        <w:spacing w:before="40" w:after="0"/>
+        <w:spacing w:before="60" w:after="0"/>
       </w:pPr>
       <w:r>
         <w:rPr>
@@ -441,9 +473,9 @@
           <w:b/>
           <w:i w:val="0"/>
           <w:color w:val="0B2B26"/>
-          <w:sz w:val="17"/>
+          <w:sz w:val="19"/>
         </w:rPr>
-        <w:t>Neko Food House POS &amp; Inventory System | Team Capstone</w:t>
+        <w:t>Neko Food House POS &amp; Inventory System</w:t>
       </w:r>
       <w:r>
         <w:tab/>
@@ -454,15 +486,31 @@
           <w:b/>
           <w:i w:val="0"/>
           <w:color w:val="52615D"/>
-          <w:sz w:val="16"/>
+          <w:sz w:val="18"/>
         </w:rPr>
         <w:t>2023 - 2024</w:t>
       </w:r>
     </w:p>
     <w:p>
       <w:pPr>
+        <w:keepNext/>
+        <w:spacing w:before="0" w:after="30"/>
+      </w:pPr>
+      <w:r>
+        <w:rPr>
+          <w:rFonts w:ascii="Arial" w:hAnsi="Arial"/>
+          <w:b w:val="0"/>
+          <w:i/>
+          <w:color w:val="52615D"/>
+          <w:sz w:val="17"/>
+        </w:rPr>
+        <w:t>Team Capstone</w:t>
+      </w:r>
+    </w:p>
+    <w:p>
+      <w:pPr>
         <w:keepLines/>
-        <w:spacing w:before="0" w:after="24" w:line="245" w:lineRule="auto"/>
+        <w:spacing w:before="0" w:after="40" w:line="252" w:lineRule="auto"/>
         <w:numPr>
           <w:ilvl w:val="0"/>
           <w:numId w:val="10"/>
@@ -474,7 +522,7 @@
           <w:b w:val="0"/>
           <w:i w:val="0"/>
           <w:color w:val="17211F"/>
-          <w:sz w:val="16"/>
+          <w:sz w:val="18"/>
         </w:rPr>
         <w:t>Contributed to C# development, UI/UX design, and debugging for a computerized sales and inventory system.</w:t>
       </w:r>
@@ -482,7 +530,7 @@
     <w:p>
       <w:pPr>
         <w:keepLines/>
-        <w:spacing w:before="0" w:after="24" w:line="245" w:lineRule="auto"/>
+        <w:spacing w:before="0" w:after="40" w:line="252" w:lineRule="auto"/>
         <w:numPr>
           <w:ilvl w:val="0"/>
           <w:numId w:val="10"/>
@@ -494,14 +542,14 @@
           <w:b w:val="0"/>
           <w:i w:val="0"/>
           <w:color w:val="17211F"/>
-          <w:sz w:val="16"/>
+          <w:sz w:val="18"/>
         </w:rPr>
         <w:t>Supported sales and inventory workflows, automated reporting, inventory alerts, and light/dark login themes as part of the capstone team.</w:t>
       </w:r>
     </w:p>
     <w:p>
       <w:pPr>
-        <w:spacing w:before="0" w:after="40" w:line="245" w:lineRule="auto"/>
+        <w:spacing w:before="30" w:after="80" w:line="252" w:lineRule="auto"/>
       </w:pPr>
       <w:r>
         <w:rPr>
@@ -509,7 +557,7 @@
           <w:b/>
           <w:i w:val="0"/>
           <w:color w:val="0B2B26"/>
-          <w:sz w:val="16"/>
+          <w:sz w:val="18"/>
         </w:rPr>
         <w:t xml:space="preserve">Selected web work: </w:t>
       </w:r>
@@ -519,9 +567,14 @@
           <w:b w:val="0"/>
           <w:i w:val="0"/>
           <w:color w:val="17211F"/>
-          <w:sz w:val="16"/>
+          <w:sz w:val="18"/>
         </w:rPr>
-        <w:t>mariaandi.com | gotoshout.com | freedomfamilyinvestments.com | proagebeauty.ph</w:t>
+        <w:t>ced-finance.pages.dev | bemunchieonline.co.uk | mariaandi.com | gotoshout.com | freedomfamilyinvestments.com | proagebeauty.ph</w:t>
+      </w:r>
+    </w:p>
+    <w:p>
+      <w:r>
+        <w:br w:type="page"/>
       </w:r>
     </w:p>
     <w:p>
@@ -535,7 +588,7 @@
           <w:b/>
           <w:i w:val="0"/>
           <w:color w:val="235347"/>
-          <w:sz w:val="20"/>
+          <w:sz w:val="21"/>
         </w:rPr>
         <w:t>EDUCATION &amp; RECOGNITION</w:t>
       </w:r>
@@ -544,9 +597,9 @@
       <w:pPr>
         <w:keepNext/>
         <w:tabs>
-          <w:tab w:pos="10368" w:val="right"/>
+          <w:tab w:pos="10224" w:val="right"/>
         </w:tabs>
-        <w:spacing w:before="40" w:after="0"/>
+        <w:spacing w:before="60" w:after="0"/>
       </w:pPr>
       <w:r>
         <w:rPr>
@@ -554,9 +607,9 @@
           <w:b/>
           <w:i w:val="0"/>
           <w:color w:val="0B2B26"/>
-          <w:sz w:val="17"/>
+          <w:sz w:val="19"/>
         </w:rPr>
-        <w:t>Bachelor of Science in Information Technology | STI College Fairview</w:t>
+        <w:t>Bachelor of Science in Information Technology</w:t>
       </w:r>
       <w:r>
         <w:tab/>
@@ -567,34 +620,45 @@
           <w:b/>
           <w:i w:val="0"/>
           <w:color w:val="52615D"/>
-          <w:sz w:val="16"/>
+          <w:sz w:val="18"/>
         </w:rPr>
         <w:t>2021 - 2025</w:t>
       </w:r>
     </w:p>
     <w:p>
       <w:pPr>
-        <w:spacing w:before="0" w:after="24" w:line="245" w:lineRule="auto"/>
+        <w:keepNext/>
+        <w:spacing w:before="0" w:after="30"/>
       </w:pPr>
       <w:r>
         <w:rPr>
           <w:rFonts w:ascii="Arial" w:hAnsi="Arial"/>
-          <w:b/>
-          <w:i w:val="0"/>
-          <w:color w:val="0B2B26"/>
-          <w:sz w:val="16"/>
+          <w:b w:val="0"/>
+          <w:i/>
+          <w:color w:val="52615D"/>
+          <w:sz w:val="17"/>
         </w:rPr>
-        <w:t xml:space="preserve">Recognition: </w:t>
+        <w:t>STI College Fairview</w:t>
       </w:r>
+    </w:p>
+    <w:p>
+      <w:pPr>
+        <w:keepLines/>
+        <w:spacing w:before="0" w:after="40" w:line="252" w:lineRule="auto"/>
+        <w:numPr>
+          <w:ilvl w:val="0"/>
+          <w:numId w:val="10"/>
+        </w:numPr>
+      </w:pPr>
       <w:r>
         <w:rPr>
           <w:rFonts w:ascii="Arial" w:hAnsi="Arial"/>
           <w:b w:val="0"/>
           <w:i w:val="0"/>
           <w:color w:val="17211F"/>
-          <w:sz w:val="16"/>
+          <w:sz w:val="18"/>
         </w:rPr>
-        <w:t>STI Programmer of the Year (2024); Best Thesis - Neko Food House Sales &amp; Inventory System (2024)</w:t>
+        <w:t>GWA: 1.85</w:t>
       </w:r>
     </w:p>
     <w:p>
@@ -608,14 +672,14 @@
           <w:b/>
           <w:i w:val="0"/>
           <w:color w:val="235347"/>
-          <w:sz w:val="20"/>
+          <w:sz w:val="21"/>
         </w:rPr>
         <w:t>TECHNICAL SKILLS</w:t>
       </w:r>
     </w:p>
     <w:p>
       <w:pPr>
-        <w:spacing w:before="0" w:after="24" w:line="245" w:lineRule="auto"/>
+        <w:spacing w:before="30" w:after="50" w:line="252" w:lineRule="auto"/>
       </w:pPr>
       <w:r>
         <w:rPr>
@@ -623,7 +687,7 @@
           <w:b/>
           <w:i w:val="0"/>
           <w:color w:val="0B2B26"/>
-          <w:sz w:val="16"/>
+          <w:sz w:val="18"/>
         </w:rPr>
         <w:t xml:space="preserve">Development: </w:t>
       </w:r>
@@ -633,14 +697,14 @@
           <w:b w:val="0"/>
           <w:i w:val="0"/>
           <w:color w:val="17211F"/>
-          <w:sz w:val="16"/>
+          <w:sz w:val="18"/>
         </w:rPr>
         <w:t>PHP, Laravel, JavaScript, React, HTML, CSS, WordPress, Elementor, Shopify, C#, Java</w:t>
       </w:r>
     </w:p>
     <w:p>
       <w:pPr>
-        <w:spacing w:before="0" w:after="24" w:line="245" w:lineRule="auto"/>
+        <w:spacing w:before="30" w:after="50" w:line="252" w:lineRule="auto"/>
       </w:pPr>
       <w:r>
         <w:rPr>
@@ -648,7 +712,7 @@
           <w:b/>
           <w:i w:val="0"/>
           <w:color w:val="0B2B26"/>
-          <w:sz w:val="16"/>
+          <w:sz w:val="18"/>
         </w:rPr>
         <w:t xml:space="preserve">QA &amp; Automation: </w:t>
       </w:r>
@@ -658,14 +722,14 @@
           <w:b w:val="0"/>
           <w:i w:val="0"/>
           <w:color w:val="17211F"/>
-          <w:sz w:val="16"/>
+          <w:sz w:val="18"/>
         </w:rPr>
         <w:t>Manual Testing, Functional Testing, Regression Testing, UI/UX &amp; Usability Testing, Responsive Testing, Test Case Design, Bug Reporting, Maestro, Playwright, Jira</w:t>
       </w:r>
     </w:p>
     <w:p>
       <w:pPr>
-        <w:spacing w:before="0" w:after="24" w:line="245" w:lineRule="auto"/>
+        <w:spacing w:before="30" w:after="50" w:line="252" w:lineRule="auto"/>
       </w:pPr>
       <w:r>
         <w:rPr>
@@ -673,7 +737,7 @@
           <w:b/>
           <w:i w:val="0"/>
           <w:color w:val="0B2B26"/>
-          <w:sz w:val="16"/>
+          <w:sz w:val="18"/>
         </w:rPr>
         <w:t xml:space="preserve">SEO &amp; Support: </w:t>
       </w:r>
@@ -683,14 +747,14 @@
           <w:b w:val="0"/>
           <w:i w:val="0"/>
           <w:color w:val="17211F"/>
-          <w:sz w:val="16"/>
+          <w:sz w:val="18"/>
         </w:rPr>
         <w:t>Semrush, Technical SEO, On-Page SEO, Keyword Research, Site Audits, Website Troubleshooting, Client Support</w:t>
       </w:r>
     </w:p>
     <w:p>
       <w:pPr>
-        <w:spacing w:before="0" w:after="0" w:line="245" w:lineRule="auto"/>
+        <w:spacing w:before="30" w:after="80" w:line="252" w:lineRule="auto"/>
       </w:pPr>
       <w:r>
         <w:rPr>
@@ -698,7 +762,7 @@
           <w:b/>
           <w:i w:val="0"/>
           <w:color w:val="0B2B26"/>
-          <w:sz w:val="16"/>
+          <w:sz w:val="18"/>
         </w:rPr>
         <w:t xml:space="preserve">Tools &amp; Data: </w:t>
       </w:r>
@@ -708,42 +772,451 @@
           <w:b w:val="0"/>
           <w:i w:val="0"/>
           <w:color w:val="17211F"/>
-          <w:sz w:val="16"/>
+          <w:sz w:val="18"/>
         </w:rPr>
         <w:t>MySQL, Supabase, XAMPP, Git, GitHub, Canva, Figma, Photoshop, Notion, AI-assisted development and testing workflows</w:t>
       </w:r>
     </w:p>
+    <w:p>
+      <w:pPr>
+        <w:pStyle w:val="Heading1"/>
+        <w:keepNext/>
+      </w:pPr>
+      <w:r>
+        <w:rPr>
+          <w:rFonts w:ascii="Arial" w:hAnsi="Arial"/>
+          <w:b/>
+          <w:i w:val="0"/>
+          <w:color w:val="235347"/>
+          <w:sz w:val="21"/>
+        </w:rPr>
+        <w:t>CERTIFICATES</w:t>
+      </w:r>
+    </w:p>
+    <w:p>
+      <w:pPr>
+        <w:keepNext/>
+        <w:tabs>
+          <w:tab w:pos="10224" w:val="right"/>
+        </w:tabs>
+        <w:spacing w:before="60" w:after="0"/>
+      </w:pPr>
+      <w:r>
+        <w:rPr>
+          <w:rFonts w:ascii="Arial" w:hAnsi="Arial"/>
+          <w:b/>
+          <w:i w:val="0"/>
+          <w:color w:val="0B2B26"/>
+          <w:sz w:val="19"/>
+        </w:rPr>
+        <w:t>Java Foundation</w:t>
+      </w:r>
+      <w:r>
+        <w:tab/>
+      </w:r>
+      <w:r>
+        <w:rPr>
+          <w:rFonts w:ascii="Arial" w:hAnsi="Arial"/>
+          <w:b/>
+          <w:i w:val="0"/>
+          <w:color w:val="52615D"/>
+          <w:sz w:val="18"/>
+        </w:rPr>
+        <w:t>2022</w:t>
+      </w:r>
+    </w:p>
+    <w:p>
+      <w:pPr>
+        <w:keepLines/>
+        <w:spacing w:before="0" w:after="40" w:line="252" w:lineRule="auto"/>
+        <w:numPr>
+          <w:ilvl w:val="0"/>
+          <w:numId w:val="10"/>
+        </w:numPr>
+      </w:pPr>
+      <w:r>
+        <w:rPr>
+          <w:rFonts w:ascii="Arial" w:hAnsi="Arial"/>
+          <w:b w:val="0"/>
+          <w:i w:val="0"/>
+          <w:color w:val="17211F"/>
+          <w:sz w:val="18"/>
+        </w:rPr>
+        <w:t>Completed Java course at STI College Fairview for enhancing data structure and OOP.</w:t>
+      </w:r>
+    </w:p>
+    <w:p>
+      <w:pPr>
+        <w:keepNext/>
+        <w:tabs>
+          <w:tab w:pos="10224" w:val="right"/>
+        </w:tabs>
+        <w:spacing w:before="60" w:after="0"/>
+      </w:pPr>
+      <w:r>
+        <w:rPr>
+          <w:rFonts w:ascii="Arial" w:hAnsi="Arial"/>
+          <w:b/>
+          <w:i w:val="0"/>
+          <w:color w:val="0B2B26"/>
+          <w:sz w:val="19"/>
+        </w:rPr>
+        <w:t>System Administration</w:t>
+      </w:r>
+      <w:r>
+        <w:tab/>
+      </w:r>
+      <w:r>
+        <w:rPr>
+          <w:rFonts w:ascii="Arial" w:hAnsi="Arial"/>
+          <w:b/>
+          <w:i w:val="0"/>
+          <w:color w:val="52615D"/>
+          <w:sz w:val="18"/>
+        </w:rPr>
+        <w:t>2022</w:t>
+      </w:r>
+    </w:p>
+    <w:p>
+      <w:pPr>
+        <w:keepLines/>
+        <w:spacing w:before="0" w:after="40" w:line="252" w:lineRule="auto"/>
+        <w:numPr>
+          <w:ilvl w:val="0"/>
+          <w:numId w:val="10"/>
+        </w:numPr>
+      </w:pPr>
+      <w:r>
+        <w:rPr>
+          <w:rFonts w:ascii="Arial" w:hAnsi="Arial"/>
+          <w:b w:val="0"/>
+          <w:i w:val="0"/>
+          <w:color w:val="17211F"/>
+          <w:sz w:val="18"/>
+        </w:rPr>
+        <w:t>Maintaining computer systems, servers, and networks for efficient and reliability.</w:t>
+      </w:r>
+    </w:p>
+    <w:p>
+      <w:pPr>
+        <w:keepNext/>
+        <w:tabs>
+          <w:tab w:pos="10224" w:val="right"/>
+        </w:tabs>
+        <w:spacing w:before="60" w:after="0"/>
+      </w:pPr>
+      <w:r>
+        <w:rPr>
+          <w:rFonts w:ascii="Arial" w:hAnsi="Arial"/>
+          <w:b/>
+          <w:i w:val="0"/>
+          <w:color w:val="0B2B26"/>
+          <w:sz w:val="19"/>
+        </w:rPr>
+        <w:t>SAP Business</w:t>
+      </w:r>
+      <w:r>
+        <w:tab/>
+      </w:r>
+      <w:r>
+        <w:rPr>
+          <w:rFonts w:ascii="Arial" w:hAnsi="Arial"/>
+          <w:b/>
+          <w:i w:val="0"/>
+          <w:color w:val="52615D"/>
+          <w:sz w:val="18"/>
+        </w:rPr>
+        <w:t>2022</w:t>
+      </w:r>
+    </w:p>
+    <w:p>
+      <w:pPr>
+        <w:keepLines/>
+        <w:spacing w:before="0" w:after="40" w:line="252" w:lineRule="auto"/>
+        <w:numPr>
+          <w:ilvl w:val="0"/>
+          <w:numId w:val="10"/>
+        </w:numPr>
+      </w:pPr>
+      <w:r>
+        <w:rPr>
+          <w:rFonts w:ascii="Arial" w:hAnsi="Arial"/>
+          <w:b w:val="0"/>
+          <w:i w:val="0"/>
+          <w:color w:val="17211F"/>
+          <w:sz w:val="18"/>
+        </w:rPr>
+        <w:t>Completed the Financial accounting for updating ledgers and creating orders.</w:t>
+      </w:r>
+    </w:p>
+    <w:p>
+      <w:pPr>
+        <w:keepNext/>
+        <w:tabs>
+          <w:tab w:pos="10224" w:val="right"/>
+        </w:tabs>
+        <w:spacing w:before="60" w:after="0"/>
+      </w:pPr>
+      <w:r>
+        <w:rPr>
+          <w:rFonts w:ascii="Arial" w:hAnsi="Arial"/>
+          <w:b/>
+          <w:i w:val="0"/>
+          <w:color w:val="0B2B26"/>
+          <w:sz w:val="19"/>
+        </w:rPr>
+        <w:t>SAP Advanced</w:t>
+      </w:r>
+      <w:r>
+        <w:tab/>
+      </w:r>
+      <w:r>
+        <w:rPr>
+          <w:rFonts w:ascii="Arial" w:hAnsi="Arial"/>
+          <w:b/>
+          <w:i w:val="0"/>
+          <w:color w:val="52615D"/>
+          <w:sz w:val="18"/>
+        </w:rPr>
+        <w:t>2023</w:t>
+      </w:r>
+    </w:p>
+    <w:p>
+      <w:pPr>
+        <w:keepLines/>
+        <w:spacing w:before="0" w:after="40" w:line="252" w:lineRule="auto"/>
+        <w:numPr>
+          <w:ilvl w:val="0"/>
+          <w:numId w:val="10"/>
+        </w:numPr>
+      </w:pPr>
+      <w:r>
+        <w:rPr>
+          <w:rFonts w:ascii="Arial" w:hAnsi="Arial"/>
+          <w:b w:val="0"/>
+          <w:i w:val="0"/>
+          <w:color w:val="17211F"/>
+          <w:sz w:val="18"/>
+        </w:rPr>
+        <w:t>Updating customer demands and creating the delivery, warehouse, invoice creation.</w:t>
+      </w:r>
+    </w:p>
+    <w:p>
+      <w:pPr>
+        <w:keepNext/>
+        <w:tabs>
+          <w:tab w:pos="10224" w:val="right"/>
+        </w:tabs>
+        <w:spacing w:before="60" w:after="0"/>
+      </w:pPr>
+      <w:r>
+        <w:rPr>
+          <w:rFonts w:ascii="Arial" w:hAnsi="Arial"/>
+          <w:b/>
+          <w:i w:val="0"/>
+          <w:color w:val="0B2B26"/>
+          <w:sz w:val="19"/>
+        </w:rPr>
+        <w:t>Best in Thesis</w:t>
+      </w:r>
+      <w:r>
+        <w:tab/>
+      </w:r>
+      <w:r>
+        <w:rPr>
+          <w:rFonts w:ascii="Arial" w:hAnsi="Arial"/>
+          <w:b/>
+          <w:i w:val="0"/>
+          <w:color w:val="52615D"/>
+          <w:sz w:val="18"/>
+        </w:rPr>
+        <w:t>2024</w:t>
+      </w:r>
+    </w:p>
+    <w:p>
+      <w:pPr>
+        <w:keepLines/>
+        <w:spacing w:before="0" w:after="40" w:line="252" w:lineRule="auto"/>
+        <w:numPr>
+          <w:ilvl w:val="0"/>
+          <w:numId w:val="10"/>
+        </w:numPr>
+      </w:pPr>
+      <w:r>
+        <w:rPr>
+          <w:rFonts w:ascii="Arial" w:hAnsi="Arial"/>
+          <w:b w:val="0"/>
+          <w:i w:val="0"/>
+          <w:color w:val="17211F"/>
+          <w:sz w:val="18"/>
+        </w:rPr>
+        <w:t>Thesis Capstone Computerize Sales and Inventory for Neko Food House.</w:t>
+      </w:r>
+    </w:p>
+    <w:p>
+      <w:pPr>
+        <w:keepNext/>
+        <w:tabs>
+          <w:tab w:pos="10224" w:val="right"/>
+        </w:tabs>
+        <w:spacing w:before="60" w:after="0"/>
+      </w:pPr>
+      <w:r>
+        <w:rPr>
+          <w:rFonts w:ascii="Arial" w:hAnsi="Arial"/>
+          <w:b/>
+          <w:i w:val="0"/>
+          <w:color w:val="0B2B26"/>
+          <w:sz w:val="19"/>
+        </w:rPr>
+        <w:t>STI Programmer of the Year</w:t>
+      </w:r>
+      <w:r>
+        <w:tab/>
+      </w:r>
+      <w:r>
+        <w:rPr>
+          <w:rFonts w:ascii="Arial" w:hAnsi="Arial"/>
+          <w:b/>
+          <w:i w:val="0"/>
+          <w:color w:val="52615D"/>
+          <w:sz w:val="18"/>
+        </w:rPr>
+        <w:t>2024</w:t>
+      </w:r>
+    </w:p>
+    <w:p>
+      <w:pPr>
+        <w:keepLines/>
+        <w:spacing w:before="0" w:after="40" w:line="252" w:lineRule="auto"/>
+        <w:numPr>
+          <w:ilvl w:val="0"/>
+          <w:numId w:val="10"/>
+        </w:numPr>
+      </w:pPr>
+      <w:r>
+        <w:rPr>
+          <w:rFonts w:ascii="Arial" w:hAnsi="Arial"/>
+          <w:b w:val="0"/>
+          <w:i w:val="0"/>
+          <w:color w:val="17211F"/>
+          <w:sz w:val="18"/>
+        </w:rPr>
+        <w:t>Earning the title by proving Software Development, Debugging, UI/UX Design.</w:t>
+      </w:r>
+    </w:p>
+    <w:p>
+      <w:pPr>
+        <w:keepNext/>
+        <w:tabs>
+          <w:tab w:pos="10224" w:val="right"/>
+        </w:tabs>
+        <w:spacing w:before="60" w:after="0"/>
+      </w:pPr>
+      <w:r>
+        <w:rPr>
+          <w:rFonts w:ascii="Arial" w:hAnsi="Arial"/>
+          <w:b/>
+          <w:i w:val="0"/>
+          <w:color w:val="0B2B26"/>
+          <w:sz w:val="19"/>
+        </w:rPr>
+        <w:t>Foundation of Usability Testing</w:t>
+      </w:r>
+      <w:r>
+        <w:tab/>
+      </w:r>
+      <w:r>
+        <w:rPr>
+          <w:rFonts w:ascii="Arial" w:hAnsi="Arial"/>
+          <w:b/>
+          <w:i w:val="0"/>
+          <w:color w:val="52615D"/>
+          <w:sz w:val="18"/>
+        </w:rPr>
+        <w:t>2025</w:t>
+      </w:r>
+    </w:p>
+    <w:p>
+      <w:pPr>
+        <w:keepLines/>
+        <w:spacing w:before="0" w:after="40" w:line="252" w:lineRule="auto"/>
+        <w:numPr>
+          <w:ilvl w:val="0"/>
+          <w:numId w:val="10"/>
+        </w:numPr>
+      </w:pPr>
+      <w:r>
+        <w:rPr>
+          <w:rFonts w:ascii="Arial" w:hAnsi="Arial"/>
+          <w:b w:val="0"/>
+          <w:i w:val="0"/>
+          <w:color w:val="17211F"/>
+          <w:sz w:val="18"/>
+        </w:rPr>
+        <w:t>Completed Usability Testing Course enhancing my debugging skills and error checking</w:t>
+      </w:r>
+    </w:p>
+    <w:p>
+      <w:pPr>
+        <w:keepNext/>
+        <w:tabs>
+          <w:tab w:pos="10224" w:val="right"/>
+        </w:tabs>
+        <w:spacing w:before="60" w:after="0"/>
+      </w:pPr>
+      <w:r>
+        <w:rPr>
+          <w:rFonts w:ascii="Arial" w:hAnsi="Arial"/>
+          <w:b/>
+          <w:i w:val="0"/>
+          <w:color w:val="0B2B26"/>
+          <w:sz w:val="19"/>
+        </w:rPr>
+        <w:t>Mastering Usability Testing: Techniques and Best Practices</w:t>
+      </w:r>
+      <w:r>
+        <w:tab/>
+      </w:r>
+      <w:r>
+        <w:rPr>
+          <w:rFonts w:ascii="Arial" w:hAnsi="Arial"/>
+          <w:b/>
+          <w:i w:val="0"/>
+          <w:color w:val="52615D"/>
+          <w:sz w:val="18"/>
+        </w:rPr>
+        <w:t>2025</w:t>
+      </w:r>
+    </w:p>
+    <w:p>
+      <w:pPr>
+        <w:keepLines/>
+        <w:spacing w:before="0" w:after="40" w:line="252" w:lineRule="auto"/>
+        <w:numPr>
+          <w:ilvl w:val="0"/>
+          <w:numId w:val="10"/>
+        </w:numPr>
+      </w:pPr>
+      <w:r>
+        <w:rPr>
+          <w:rFonts w:ascii="Arial" w:hAnsi="Arial"/>
+          <w:b w:val="0"/>
+          <w:i w:val="0"/>
+          <w:color w:val="17211F"/>
+          <w:sz w:val="18"/>
+        </w:rPr>
+        <w:t>Completing the final course for Usability Testing, advanced techniques, advanced practices for usability testing better user experience.</w:t>
+      </w:r>
+    </w:p>
     <w:sectPr>
-      <w:footerReference w:type="default" r:id="rId10"/>
       <w:pgSz w:w="12240" w:h="15840"/>
-      <w:pgMar w:top="677" w:right="936" w:bottom="677" w:left="936" w:header="360" w:footer="360" w:gutter="0"/>
+      <w:pgMar w:top="792" w:right="1008" w:bottom="792" w:left="1008" w:header="720" w:footer="720" w:gutter="0"/>
       <w:cols w:space="720"/>
       <w:docGrid w:linePitch="360"/>
     </w:sectPr>
   </w:body>
 </w:document>
-</file>
-
-<file path=word/footer1.xml><?xml version="1.0" encoding="utf-8"?>
-<w:ftr xmlns:m="http://schemas.openxmlformats.org/officeDocument/2006/math" xmlns:mc="http://schemas.openxmlformats.org/markup-compatibility/2006" xmlns:mo="http://schemas.microsoft.com/office/mac/office/2008/main" xmlns:mv="urn:schemas-microsoft-com:mac:vml" xmlns:o="urn:schemas-microsoft-com:office:office" xmlns:r="http://schemas.openxmlformats.org/officeDocument/2006/relationships" xmlns:v="urn:schemas-microsoft-com:vml" xmlns:w10="urn:schemas-microsoft-com:office:word" xmlns:w14="http://schemas.microsoft.com/office/word/2010/wordml" xmlns:w="http://schemas.openxmlformats.org/wordprocessingml/2006/main" xmlns:wne="http://schemas.microsoft.com/office/word/2006/wordml" xmlns:wp14="http://schemas.microsoft.com/office/word/2010/wordprocessingDrawing" xmlns:wp="http://schemas.openxmlformats.org/drawingml/2006/wordprocessingDrawing" xmlns:wpc="http://schemas.microsoft.com/office/word/2010/wordprocessingCanvas" xmlns:wpg="http://schemas.microsoft.com/office/word/2010/wordprocessingGroup" xmlns:wpi="http://schemas.microsoft.com/office/word/2010/wordprocessingInk" xmlns:wps="http://schemas.microsoft.com/office/word/2010/wordprocessingShape" mc:Ignorable="w14 wp14">
-  <w:p>
-    <w:pPr>
-      <w:pStyle w:val="Footer"/>
-      <w:spacing w:before="0" w:after="0"/>
-      <w:jc w:val="center"/>
-    </w:pPr>
-    <w:r>
-      <w:rPr>
-        <w:rFonts w:ascii="Arial" w:hAnsi="Arial"/>
-        <w:b w:val="0"/>
-        <w:i w:val="0"/>
-        <w:color w:val="8EB69B"/>
-        <w:sz w:val="14"/>
-      </w:rPr>
-      <w:t>Cedrick Opina | Resume</w:t>
-    </w:r>
-  </w:p>
-</w:ftr>
 </file>
 
 <file path=word/numbering.xml><?xml version="1.0" encoding="utf-8"?>
@@ -1131,12 +1604,12 @@
     <w:qFormat/>
     <w:rsid w:val="00FC693F"/>
     <w:pPr>
-      <w:spacing w:before="0" w:after="24" w:line="245" w:lineRule="auto"/>
+      <w:spacing w:before="0" w:after="40" w:line="252" w:lineRule="auto"/>
     </w:pPr>
     <w:rPr>
       <w:rFonts w:ascii="Arial" w:hAnsi="Arial"/>
       <w:color w:val="17211F"/>
-      <w:sz w:val="16"/>
+      <w:sz w:val="18"/>
     </w:rPr>
   </w:style>
   <w:style w:type="paragraph" w:styleId="Header">
@@ -1194,7 +1667,7 @@
     <w:pPr>
       <w:keepNext/>
       <w:keepLines/>
-      <w:spacing w:before="90" w:after="36"/>
+      <w:spacing w:before="120" w:after="50"/>
       <w:outlineLvl w:val="0"/>
     </w:pPr>
     <w:rPr>
@@ -1202,7 +1675,7 @@
       <w:b/>
       <w:bCs/>
       <w:color w:val="235347"/>
-      <w:sz w:val="20"/>
+      <w:sz w:val="21"/>
       <w:szCs w:val="28"/>
     </w:rPr>
   </w:style>

</xml_diff>

<commit_message>
Add GitHub Actions CI pipeline and update skill matrix with CI/CD
</commit_message>
<xml_diff>
--- a/output/resume/Cedrick_Opina_Resume.docx
+++ b/output/resume/Cedrick_Opina_Resume.docx
@@ -724,7 +724,7 @@
           <w:color w:val="17211F"/>
           <w:sz w:val="18"/>
         </w:rPr>
-        <w:t>Manual Testing, Functional Testing, Regression Testing, UI/UX &amp; Usability Testing, Responsive Testing, Test Case Design, Bug Reporting, Maestro, Playwright, Jira</w:t>
+        <w:t>Manual Testing, Functional Testing, Regression Testing, UI/UX &amp; Usability Testing, Responsive Testing, Test Case Design, Bug Reporting, Maestro, Playwright, CI/CD, GitHub Actions, Jira</w:t>
       </w:r>
     </w:p>
     <w:p>
@@ -774,7 +774,7 @@
           <w:color w:val="17211F"/>
           <w:sz w:val="18"/>
         </w:rPr>
-        <w:t>MySQL, Supabase, XAMPP, Git, GitHub, Canva, Figma, Photoshop, Notion, AI-assisted development and testing workflows</w:t>
+        <w:t>MySQL, Supabase, XAMPP, Git, GitHub, CI/CD Pipelines, Canva, Figma, Photoshop, Notion, AI-assisted development and testing workflows</w:t>
       </w:r>
     </w:p>
     <w:p>

</xml_diff>